<commit_message>
docs: refine reusable Chinese task-package Word template
</commit_message>
<xml_diff>
--- a/human/templates/通用中文逐包任务模板_v4.0.docx
+++ b/human/templates/通用中文逐包任务模板_v4.0.docx
@@ -12,7 +12,7 @@
     </w:p>
     <w:p>
       <w:r>
-        <w:t>适用于科研、编程、数学建模与研究型项目。一包一份，领取时定义，执行时增量填写，复核后交接；正文只记录本包的必要事实与决定。</w:t>
+        <w:t>适用于科研、编程开发、数学建模、课程作业与投资研究。一包一份，领取时定义，执行时增量填写，复核后交接；正文只记录本包的必要事实与决定。</w:t>
       </w:r>
     </w:p>
     <w:p>
@@ -242,9 +242,9 @@
               <w:rPr>
                 <w:sz w:val="20"/>
               </w:rPr>
-              <w:t>负责人 [真实姓名或未领取]；复核人及签收人 [按需指定]</w:t>
+              <w:t>负责人 [真实姓名或未领取]；Agent职责 [实施／复核／未参与]</w:t>
               <w:br/>
-              <w:t>预计工作量 [人日]；起止日期 [待填]</w:t>
+              <w:t>复核及签收人 [按需指定]；工作量 [人日]；起止日期 [待填]</w:t>
             </w:r>
           </w:p>
         </w:tc>
@@ -317,6 +317,11 @@
     <w:p>
       <w:r>
         <w:t>范围内 [本包承担的职责与接口]；范围外 [本包不承担的职责]；约束 [时间、设备、数据、软件版本或明确规则]。</w:t>
+      </w:r>
+    </w:p>
+    <w:p>
+      <w:r>
+        <w:t>启动前确定 AC1 [核心交付的通过标准]、AC2 [下游使用条件]；有明确要求或已发现问题时再加验收项。实际结果填写在第六节，不另建重复验收清单。</w:t>
       </w:r>
     </w:p>
     <w:p>
@@ -1649,7 +1654,7 @@
     </w:tbl>
     <w:p>
       <w:r>
-        <w:t>按领域补充  科研写研究问题、主要结果与分析边界；建模写对象、基线与评价指标；开发写输入输出、运行入口与版本；投资研究写比较基准和可证伪假设。不适用内容直接删除。</w:t>
+        <w:t>按领域选填，不同时套用全部字段。科研：研究问题、原始资料、主要结果与主张范围。开发：输入输出、运行入口、版本与成品。建模：对象、基线、评价方法与可重跑结果。课程：题目要求、评分点与交付格式。投资研究：数据日期、比较基准与可证伪假设，区分回测和实际结果。</w:t>
       </w:r>
     </w:p>
     <w:p>

</xml_diff>

<commit_message>
docs: refine reusable Chinese task package Word template
</commit_message>
<xml_diff>
--- a/human/templates/通用中文逐包任务模板_v4.0.docx
+++ b/human/templates/通用中文逐包任务模板_v4.0.docx
@@ -219,6 +219,57 @@
               <w:rPr>
                 <w:sz w:val="20"/>
               </w:rPr>
+              <w:t>本次审阅请求</w:t>
+            </w:r>
+          </w:p>
+        </w:tc>
+        <w:tc>
+          <w:tcPr>
+            <w:tcW w:type="dxa" w:w="8352"/>
+            <w:vAlign w:val="center"/>
+            <w:tcMar>
+              <w:top w:w="90" w:type="dxa"/>
+              <w:left w:w="90" w:type="dxa"/>
+              <w:bottom w:w="90" w:type="dxa"/>
+              <w:right w:w="90" w:type="dxa"/>
+            </w:tcMar>
+          </w:tcPr>
+          <w:p>
+            <w:pPr>
+              <w:spacing w:after="40" w:line="264" w:lineRule="auto"/>
+            </w:pPr>
+            <w:r>
+              <w:rPr>
+                <w:sz w:val="20"/>
+              </w:rPr>
+              <w:t>[知会／确认方案／复核结果／签收交付]；[需要你决定的具体事项，无则写无]</w:t>
+            </w:r>
+          </w:p>
+        </w:tc>
+      </w:tr>
+      <w:tr>
+        <w:trPr>
+          <w:cantSplit/>
+        </w:trPr>
+        <w:tc>
+          <w:tcPr>
+            <w:tcW w:type="dxa" w:w="1728"/>
+            <w:vAlign w:val="center"/>
+            <w:tcMar>
+              <w:top w:w="90" w:type="dxa"/>
+              <w:left w:w="90" w:type="dxa"/>
+              <w:bottom w:w="90" w:type="dxa"/>
+              <w:right w:w="90" w:type="dxa"/>
+            </w:tcMar>
+          </w:tcPr>
+          <w:p>
+            <w:pPr>
+              <w:spacing w:after="40" w:line="264" w:lineRule="auto"/>
+            </w:pPr>
+            <w:r>
+              <w:rPr>
+                <w:sz w:val="20"/>
+              </w:rPr>
               <w:t>责任与时间</w:t>
             </w:r>
           </w:p>
@@ -317,6 +368,11 @@
     <w:p>
       <w:r>
         <w:t>范围内 [本包承担的职责与接口]；范围外 [本包不承担的职责]；约束 [时间、设备、数据、软件版本或明确规则]。</w:t>
+      </w:r>
+    </w:p>
+    <w:p>
+      <w:r>
+        <w:t>项目作用 [本包推动的主线目标]；反向检查 [完成标准是否足以让下游接续，整体缺口由哪个任务承担]。</w:t>
       </w:r>
     </w:p>
     <w:p>
@@ -1403,6 +1459,11 @@
         <w:t>只列执行本包必须掌握的技能；国内教程或视频用于上手，接口事实优先引用官方文档或原始资料。</w:t>
       </w:r>
     </w:p>
+    <w:p>
+      <w:r>
+        <w:t>工具基线 [本包实际使用的工具、版本和环境入口]；资料须能直接打开，填写具体章节及对应步骤，不把其他项目的版本直接搬来。</w:t>
+      </w:r>
+    </w:p>
     <w:tbl>
       <w:tblPr>
         <w:tblW w:type="auto" w:w="0"/>
@@ -1654,7 +1715,7 @@
     </w:tbl>
     <w:p>
       <w:r>
-        <w:t>按领域选填，不同时套用全部字段。科研：研究问题、原始资料、主要结果与主张范围。开发：输入输出、运行入口、版本与成品。建模：对象、基线、评价方法与可重跑结果。课程：题目要求、评分点与交付格式。投资研究：数据日期、比较基准与可证伪假设，区分回测和实际结果。</w:t>
+        <w:t>领域补充按需填写：科研填研究问题与主张；开发填接口与运行入口；建模填对象、基线与评价；课程填评分要求；投资研究填数据日期与比较基准。仅保留适用项。</w:t>
       </w:r>
     </w:p>
     <w:p>
@@ -2764,6 +2825,11 @@
       </w:tr>
     </w:tbl>
     <w:p>
+      <w:r>
+        <w:t>接收确认 [接收人、日期与实际使用结果，或待接收]；上游输出与下游输入不匹配时，写明修正归属，不仅写“已交接”。</w:t>
+      </w:r>
+    </w:p>
+    <w:p>
       <w:pPr>
         <w:pStyle w:val="Heading1"/>
       </w:pPr>

</xml_diff>